<commit_message>
Futher Progress to TCP and UDP implementation
</commit_message>
<xml_diff>
--- a/CNA - 8T - UDP.docx
+++ b/CNA - 8T - UDP.docx
@@ -8,8 +8,6 @@
         <w:spacing w:after="240" w:line="276" w:lineRule="auto"/>
         <w:jc w:val="center"/>
       </w:pPr>
-      <w:bookmarkStart w:id="0" w:name="_GoBack"/>
-      <w:bookmarkEnd w:id="0"/>
       <w:r>
         <w:t>UDP Client / Server</w:t>
       </w:r>
@@ -519,56 +517,56 @@
         </w:numPr>
         <w:spacing w:after="240" w:line="276" w:lineRule="auto"/>
         <w:rPr>
-          <w:highlight w:val="yellow"/>
-        </w:rPr>
-      </w:pPr>
-      <w:r>
-        <w:rPr>
-          <w:highlight w:val="yellow"/>
+          <w:highlight w:val="green"/>
+        </w:rPr>
+      </w:pPr>
+      <w:r>
+        <w:rPr>
+          <w:highlight w:val="green"/>
         </w:rPr>
         <w:t xml:space="preserve">Send a </w:t>
       </w:r>
       <w:r>
         <w:rPr>
-          <w:highlight w:val="yellow"/>
+          <w:highlight w:val="green"/>
         </w:rPr>
         <w:t>login packet to your Simple Client using TCP</w:t>
       </w:r>
       <w:r>
         <w:rPr>
-          <w:highlight w:val="yellow"/>
+          <w:highlight w:val="green"/>
         </w:rPr>
         <w:t xml:space="preserve"> </w:t>
       </w:r>
       <w:r>
         <w:rPr>
-          <w:highlight w:val="yellow"/>
+          <w:highlight w:val="green"/>
         </w:rPr>
         <w:t xml:space="preserve">and passing in the </w:t>
       </w:r>
       <w:proofErr w:type="spellStart"/>
       <w:r>
         <w:rPr>
-          <w:highlight w:val="yellow"/>
+          <w:highlight w:val="green"/>
         </w:rPr>
         <w:t>LocalEndPoint</w:t>
       </w:r>
       <w:proofErr w:type="spellEnd"/>
       <w:r>
         <w:rPr>
-          <w:highlight w:val="yellow"/>
+          <w:highlight w:val="green"/>
         </w:rPr>
         <w:t xml:space="preserve"> from your UDP</w:t>
       </w:r>
       <w:r>
         <w:rPr>
-          <w:highlight w:val="yellow"/>
+          <w:highlight w:val="green"/>
         </w:rPr>
         <w:t xml:space="preserve"> </w:t>
       </w:r>
       <w:r>
         <w:rPr>
-          <w:highlight w:val="yellow"/>
+          <w:highlight w:val="green"/>
         </w:rPr>
         <w:t>socket.</w:t>
       </w:r>
@@ -582,14 +580,14 @@
         </w:numPr>
         <w:spacing w:after="240" w:line="276" w:lineRule="auto"/>
         <w:rPr>
-          <w:highlight w:val="yellow"/>
+          <w:highlight w:val="green"/>
         </w:rPr>
       </w:pPr>
       <w:hyperlink r:id="rId10" w:anchor="System_Net_Sockets_Socket_LocalEndPoint" w:history="1">
         <w:r>
           <w:rPr>
             <w:rStyle w:val="Hyperlink"/>
-            <w:highlight w:val="yellow"/>
+            <w:highlight w:val="green"/>
           </w:rPr>
           <w:t>https://docs.microsoft.com/en-us/dotnet/api/system.net.sockets.socket.localendpoint?view=netframework-4.8#System_Net_Sockets_Socket_LocalEndPoint</w:t>
         </w:r>
@@ -733,17 +731,32 @@
           <w:numId w:val="3"/>
         </w:numPr>
         <w:spacing w:after="240"/>
-      </w:pPr>
-      <w:r>
+        <w:rPr>
+          <w:highlight w:val="green"/>
+        </w:rPr>
+      </w:pPr>
+      <w:r>
+        <w:rPr>
+          <w:highlight w:val="green"/>
+        </w:rPr>
         <w:t xml:space="preserve">You can move your read methods </w:t>
       </w:r>
       <w:r>
+        <w:rPr>
+          <w:highlight w:val="green"/>
+        </w:rPr>
         <w:t xml:space="preserve">to your client and simply call them in your </w:t>
       </w:r>
       <w:r>
+        <w:rPr>
+          <w:highlight w:val="green"/>
+        </w:rPr>
         <w:t>client method</w:t>
       </w:r>
       <w:r>
+        <w:rPr>
+          <w:highlight w:val="green"/>
+        </w:rPr>
         <w:t xml:space="preserve"> on your server</w:t>
       </w:r>
     </w:p>
@@ -755,10 +768,14 @@
           <w:numId w:val="3"/>
         </w:numPr>
         <w:spacing w:after="240"/>
+        <w:rPr>
+          <w:highlight w:val="green"/>
+        </w:rPr>
       </w:pPr>
       <w:r>
         <w:rPr>
           <w:noProof/>
+          <w:highlight w:val="green"/>
         </w:rPr>
         <w:drawing>
           <wp:inline distT="0" distB="0" distL="0" distR="0" wp14:anchorId="602BAB28" wp14:editId="06520E9A">
@@ -805,10 +822,14 @@
           <w:numId w:val="3"/>
         </w:numPr>
         <w:spacing w:after="240"/>
+        <w:rPr>
+          <w:highlight w:val="green"/>
+        </w:rPr>
       </w:pPr>
       <w:r>
         <w:rPr>
           <w:noProof/>
+          <w:highlight w:val="green"/>
         </w:rPr>
         <w:drawing>
           <wp:inline distT="0" distB="0" distL="0" distR="0" wp14:anchorId="01D8E573" wp14:editId="78E72725">
@@ -855,19 +876,34 @@
           <w:numId w:val="3"/>
         </w:numPr>
         <w:spacing w:after="240"/>
-      </w:pPr>
-      <w:r>
+        <w:rPr>
+          <w:highlight w:val="green"/>
+        </w:rPr>
+      </w:pPr>
+      <w:r>
+        <w:rPr>
+          <w:highlight w:val="green"/>
+        </w:rPr>
         <w:t>To read on you</w:t>
       </w:r>
       <w:r>
+        <w:rPr>
+          <w:highlight w:val="green"/>
+        </w:rPr>
         <w:t xml:space="preserve">r </w:t>
       </w:r>
       <w:proofErr w:type="spellStart"/>
       <w:r>
+        <w:rPr>
+          <w:highlight w:val="green"/>
+        </w:rPr>
         <w:t>UDPsocket</w:t>
       </w:r>
       <w:proofErr w:type="spellEnd"/>
       <w:r>
+        <w:rPr>
+          <w:highlight w:val="green"/>
+        </w:rPr>
         <w:t xml:space="preserve"> </w:t>
       </w:r>
     </w:p>
@@ -885,6 +921,7 @@
           <w:color w:val="000000"/>
           <w:sz w:val="19"/>
           <w:szCs w:val="19"/>
+          <w:highlight w:val="green"/>
         </w:rPr>
       </w:pPr>
       <w:proofErr w:type="gramStart"/>
@@ -895,6 +932,7 @@
           <w:color w:val="000000"/>
           <w:sz w:val="19"/>
           <w:szCs w:val="19"/>
+          <w:highlight w:val="green"/>
         </w:rPr>
         <w:t>byte[</w:t>
       </w:r>
@@ -906,6 +944,7 @@
           <w:color w:val="000000"/>
           <w:sz w:val="19"/>
           <w:szCs w:val="19"/>
+          <w:highlight w:val="green"/>
         </w:rPr>
         <w:t>] bytes = new byte[256];</w:t>
       </w:r>
@@ -924,6 +963,7 @@
           <w:color w:val="000000"/>
           <w:sz w:val="19"/>
           <w:szCs w:val="19"/>
+          <w:highlight w:val="green"/>
         </w:rPr>
       </w:pPr>
       <w:r>
@@ -933,6 +973,7 @@
           <w:color w:val="000000"/>
           <w:sz w:val="19"/>
           <w:szCs w:val="19"/>
+          <w:highlight w:val="green"/>
         </w:rPr>
         <w:t>if ((</w:t>
       </w:r>
@@ -944,6 +985,7 @@
           <w:color w:val="000000"/>
           <w:sz w:val="19"/>
           <w:szCs w:val="19"/>
+          <w:highlight w:val="green"/>
         </w:rPr>
         <w:t>noOfIncomingBytes</w:t>
       </w:r>
@@ -955,6 +997,7 @@
           <w:color w:val="000000"/>
           <w:sz w:val="19"/>
           <w:szCs w:val="19"/>
+          <w:highlight w:val="green"/>
         </w:rPr>
         <w:t xml:space="preserve"> = _</w:t>
       </w:r>
@@ -966,6 +1009,7 @@
           <w:color w:val="000000"/>
           <w:sz w:val="19"/>
           <w:szCs w:val="19"/>
+          <w:highlight w:val="green"/>
         </w:rPr>
         <w:t>UDPsocket.Receive</w:t>
       </w:r>
@@ -977,6 +1021,7 @@
           <w:color w:val="000000"/>
           <w:sz w:val="19"/>
           <w:szCs w:val="19"/>
+          <w:highlight w:val="green"/>
         </w:rPr>
         <w:t>(bytes)</w:t>
       </w:r>
@@ -988,6 +1033,7 @@
           <w:color w:val="000000"/>
           <w:sz w:val="19"/>
           <w:szCs w:val="19"/>
+          <w:highlight w:val="green"/>
         </w:rPr>
         <w:t>) !</w:t>
       </w:r>
@@ -999,6 +1045,7 @@
           <w:color w:val="000000"/>
           <w:sz w:val="19"/>
           <w:szCs w:val="19"/>
+          <w:highlight w:val="green"/>
         </w:rPr>
         <w:t>= 0)</w:t>
       </w:r>
@@ -1061,34 +1108,58 @@
           <w:numId w:val="4"/>
         </w:numPr>
         <w:spacing w:after="240"/>
-      </w:pPr>
-      <w:r>
+        <w:rPr>
+          <w:highlight w:val="green"/>
+        </w:rPr>
+      </w:pPr>
+      <w:r>
+        <w:rPr>
+          <w:highlight w:val="green"/>
+        </w:rPr>
         <w:t xml:space="preserve">This does everything your </w:t>
       </w:r>
       <w:proofErr w:type="spellStart"/>
       <w:r>
+        <w:rPr>
+          <w:highlight w:val="green"/>
+        </w:rPr>
         <w:t>TCPClientMethod</w:t>
       </w:r>
       <w:proofErr w:type="spellEnd"/>
       <w:r>
+        <w:rPr>
+          <w:highlight w:val="green"/>
+        </w:rPr>
         <w:t xml:space="preserve"> does except it should read from the UDP socket</w:t>
       </w:r>
     </w:p>
     <w:p>
       <w:pPr>
         <w:pStyle w:val="Heading3"/>
+        <w:rPr>
+          <w:highlight w:val="yellow"/>
+        </w:rPr>
       </w:pPr>
       <w:proofErr w:type="spellStart"/>
       <w:proofErr w:type="gramStart"/>
       <w:r>
+        <w:rPr>
+          <w:highlight w:val="yellow"/>
+        </w:rPr>
         <w:t>HandlePacket</w:t>
       </w:r>
       <w:proofErr w:type="spellEnd"/>
       <w:r>
+        <w:rPr>
+          <w:highlight w:val="yellow"/>
+        </w:rPr>
         <w:t>(</w:t>
       </w:r>
       <w:proofErr w:type="gramEnd"/>
       <w:r>
+        <w:rPr>
+          <w:highlight w:val="yellow"/>
+        </w:rPr>
         <w:t>)</w:t>
       </w:r>
     </w:p>
@@ -1099,12 +1170,21 @@
           <w:ilvl w:val="0"/>
           <w:numId w:val="4"/>
         </w:numPr>
-      </w:pPr>
-      <w:r>
+        <w:rPr>
+          <w:highlight w:val="yellow"/>
+        </w:rPr>
+      </w:pPr>
+      <w:r>
+        <w:rPr>
+          <w:highlight w:val="yellow"/>
+        </w:rPr>
         <w:t xml:space="preserve">When you receive a </w:t>
       </w:r>
       <w:proofErr w:type="spellStart"/>
       <w:r>
+        <w:rPr>
+          <w:highlight w:val="yellow"/>
+        </w:rPr>
         <w:t>LoginPacket</w:t>
       </w:r>
       <w:proofErr w:type="spellEnd"/>
@@ -1116,12 +1196,21 @@
           <w:ilvl w:val="1"/>
           <w:numId w:val="4"/>
         </w:numPr>
-      </w:pPr>
-      <w:r>
+        <w:rPr>
+          <w:highlight w:val="yellow"/>
+        </w:rPr>
+      </w:pPr>
+      <w:r>
+        <w:rPr>
+          <w:highlight w:val="yellow"/>
+        </w:rPr>
         <w:t xml:space="preserve">Call </w:t>
       </w:r>
       <w:proofErr w:type="spellStart"/>
       <w:r>
+        <w:rPr>
+          <w:highlight w:val="yellow"/>
+        </w:rPr>
         <w:t>Client.UDPConnect</w:t>
       </w:r>
       <w:proofErr w:type="spellEnd"/>
@@ -1133,21 +1222,36 @@
           <w:ilvl w:val="1"/>
           <w:numId w:val="4"/>
         </w:numPr>
-      </w:pPr>
-      <w:r>
+        <w:rPr>
+          <w:highlight w:val="yellow"/>
+        </w:rPr>
+      </w:pPr>
+      <w:r>
+        <w:rPr>
+          <w:highlight w:val="yellow"/>
+        </w:rPr>
         <w:t xml:space="preserve">Start a new thread that runs </w:t>
       </w:r>
       <w:proofErr w:type="spellStart"/>
       <w:proofErr w:type="gramStart"/>
       <w:r>
+        <w:rPr>
+          <w:highlight w:val="yellow"/>
+        </w:rPr>
         <w:t>UDPClientMethod</w:t>
       </w:r>
       <w:proofErr w:type="spellEnd"/>
       <w:r>
+        <w:rPr>
+          <w:highlight w:val="yellow"/>
+        </w:rPr>
         <w:t>(</w:t>
       </w:r>
       <w:proofErr w:type="gramEnd"/>
       <w:r>
+        <w:rPr>
+          <w:highlight w:val="yellow"/>
+        </w:rPr>
         <w:t>)</w:t>
       </w:r>
     </w:p>
@@ -1159,6 +1263,8 @@
       <w:r>
         <w:t>SimpleClient</w:t>
       </w:r>
+      <w:bookmarkStart w:id="0" w:name="_GoBack"/>
+      <w:bookmarkEnd w:id="0"/>
       <w:proofErr w:type="spellEnd"/>
     </w:p>
     <w:p>

</xml_diff>